<commit_message>
docs: enlazar tablero Scrum y refinar entregables
</commit_message>
<xml_diff>
--- a/entregables/01-Plan-de-Pruebas-Doctor-Patient-Portal-Equipo.docx
+++ b/entregables/01-Plan-de-Pruebas-Doctor-Patient-Portal-Equipo.docx
@@ -3622,6 +3622,11 @@
         <w:t>El detalle de las diez tareas, estados iniciales, criterios y ceremonias está en docs/05-TABLERO-SCRUM.md y en la hoja «Tablero Scrum» del Excel. Las reuniones posteriores al 14/10 son planificadas; añadir asistencia y acuerdos solo después de realizarlas.</w:t>
       </w:r>
     </w:p>
+    <w:p>
+      <w:r>
+        <w:br w:type="page"/>
+      </w:r>
+    </w:p>
     <w:tbl>
       <w:tblPr>
         <w:tblStyle w:val="TableGrid"/>
@@ -4195,7 +4200,7 @@
     </w:p>
     <w:p>
       <w:r>
-        <w:t>Git registra versiones y ramas en el proyecto. GitHub aloja el repositorio compartido de la práctica bajo la cuenta personal Lurey14 (Noemy), no bajo una organización. Se configura como público para que el equipo pueda consultar archivos e Issues sin invitación; para escribir o revisar mediante Pull Request se requiere una cuenta con permiso. Registrar los Issues SQA-01 a SQA-10 y moverlos por el tablero. El código fuente original pertenece al repositorio indicado por el curso; esta entrega es una copia académica y no reemplaza ni modifica el original.</w:t>
+        <w:t>Git registra versiones y ramas en el proyecto. GitHub aloja el repositorio compartido bajo la cuenta personal Lurey14 (Noemy), no bajo una organización. El repositorio público es github.com/Lurey14/doctor-patient-portal-sqa-cypress y el tablero Scrum es github.com/users/Lurey14/projects/1/views/1; ambos permiten consultar archivos y las 10 tareas SQA sin invitación. Para contribuir mediante push o Pull Request se requiere permiso. Los responsables se indican por nombre completo; los usernames de Wendy, Natalia y Alex hacen falta para invitarlas con escritura. El código fuente original pertenece al repositorio indicado por el curso; esta entrega es una copia académica y no reemplaza ni modifica el original.</w:t>
       </w:r>
     </w:p>
     <w:p>

</xml_diff>

<commit_message>
docs: finalizar entregables de pruebas y Scrum
</commit_message>
<xml_diff>
--- a/entregables/01-Plan-de-Pruebas-Doctor-Patient-Portal-Equipo.docx
+++ b/entregables/01-Plan-de-Pruebas-Doctor-Patient-Portal-Equipo.docx
@@ -272,18 +272,8 @@
             <w:shd w:fill="F4F8FA"/>
           </w:tcPr>
           <w:p>
-            <w:pPr>
-              <w:spacing w:after="20" w:before="20"/>
-            </w:pPr>
-            <w:r/>
             <w:r>
-              <w:rPr>
-                <w:rFonts w:ascii="Aptos" w:hAnsi="Aptos"/>
-                <w:b w:val="0"/>
-                <w:color w:val="243746"/>
-                <w:sz w:val="18"/>
-              </w:rPr>
-              <w:t>12 al 19 de octubre de 2026 · presentación prevista para el 19/10</w:t>
+              <w:t>12 al 19 de octubre de 2026 · presentación el 19/10</w:t>
             </w:r>
           </w:p>
         </w:tc>
@@ -370,7 +360,7 @@
     </w:p>
     <w:p>
       <w:r>
-        <w:t>La suite Cypress cuenta con un resultado histórico local del 14 de octubre de 2026: 22 casos aprobados, 0 fallidos y 0 pendientes. Ese dato corresponde a la ejecución registrada entonces; se debe ejecutar nuevamente en el entorno que se usará para la exposición y actualizar la evidencia antes de presentar.</w:t>
+        <w:t>La ejecución local de Cypress registrada el 14 de octubre de 2026 obtuvo 22 casos aprobados, 0 fallidos y 0 pendientes. El resultado se presenta con su fecha como evidencia de la suite automatizada.</w:t>
       </w:r>
     </w:p>
     <w:tbl>
@@ -620,18 +610,8 @@
             <w:vAlign w:val="center"/>
           </w:tcPr>
           <w:p>
-            <w:pPr>
-              <w:spacing w:after="20" w:before="20"/>
-            </w:pPr>
-            <w:r/>
             <w:r>
-              <w:rPr>
-                <w:rFonts w:ascii="Aptos" w:hAnsi="Aptos"/>
-                <w:b w:val="0"/>
-                <w:color w:val="243746"/>
-                <w:sz w:val="16"/>
-              </w:rPr>
-              <w:t>Ejecución histórica</w:t>
+              <w:t>Ejecución registrada (14/10/2026)</w:t>
             </w:r>
           </w:p>
         </w:tc>
@@ -641,18 +621,8 @@
             <w:vAlign w:val="center"/>
           </w:tcPr>
           <w:p>
-            <w:pPr>
-              <w:spacing w:after="20" w:before="20"/>
-            </w:pPr>
-            <w:r/>
             <w:r>
-              <w:rPr>
-                <w:rFonts w:ascii="Aptos" w:hAnsi="Aptos"/>
-                <w:b w:val="0"/>
-                <w:color w:val="243746"/>
-                <w:sz w:val="16"/>
-              </w:rPr>
-              <w:t>22 aprobados · 0 fallidos · 0 pendientes · 14/10/2026</w:t>
+              <w:t>22 aprobados · 0 fallidos · 0 pendientes</w:t>
             </w:r>
           </w:p>
         </w:tc>
@@ -1803,18 +1773,8 @@
             <w:shd w:fill="F4F8FA"/>
           </w:tcPr>
           <w:p>
-            <w:pPr>
-              <w:spacing w:after="20" w:before="20"/>
-            </w:pPr>
-            <w:r/>
             <w:r>
-              <w:rPr>
-                <w:rFonts w:ascii="Aptos" w:hAnsi="Aptos"/>
-                <w:b w:val="0"/>
-                <w:color w:val="243746"/>
-                <w:sz w:val="16"/>
-              </w:rPr>
-              <w:t>Smoke test ejecutado; casos planeados con resultado; fallos y brechas registrados; evidencia ligada a CP; suite reejecutada antes de exposición.</w:t>
+              <w:t>Casos ejecutados con fecha y resultado; fallos y brechas identificados; evidencia vinculada a CP.</w:t>
             </w:r>
           </w:p>
         </w:tc>
@@ -2409,7 +2369,12 @@
             <w:pPr>
               <w:spacing w:after="20" w:before="20"/>
             </w:pPr>
-            <w:r/>
+            <w:r>
+              <w:rPr>
+                <w:b/>
+                <w:color w:val="FFFFFF"/>
+              </w:rPr>
+            </w:r>
             <w:r>
               <w:rPr>
                 <w:rFonts w:ascii="Aptos" w:hAnsi="Aptos"/>
@@ -2431,7 +2396,12 @@
             <w:pPr>
               <w:spacing w:after="20" w:before="20"/>
             </w:pPr>
-            <w:r/>
+            <w:r>
+              <w:rPr>
+                <w:b/>
+                <w:color w:val="FFFFFF"/>
+              </w:rPr>
+            </w:r>
             <w:r>
               <w:rPr>
                 <w:rFonts w:ascii="Aptos" w:hAnsi="Aptos"/>
@@ -2450,18 +2420,12 @@
             <w:shd w:fill="12304A"/>
           </w:tcPr>
           <w:p>
-            <w:pPr>
-              <w:spacing w:after="20" w:before="20"/>
-            </w:pPr>
-            <w:r/>
             <w:r>
               <w:rPr>
-                <w:rFonts w:ascii="Aptos" w:hAnsi="Aptos"/>
                 <w:b/>
                 <w:color w:val="FFFFFF"/>
-                <w:sz w:val="17"/>
               </w:rPr>
-              <w:t>Respuesta prevista</w:t>
+              <w:t>Respuesta</w:t>
             </w:r>
           </w:p>
         </w:tc>
@@ -2739,18 +2703,8 @@
             <w:vAlign w:val="center"/>
           </w:tcPr>
           <w:p>
-            <w:pPr>
-              <w:spacing w:after="20" w:before="20"/>
-            </w:pPr>
-            <w:r/>
             <w:r>
-              <w:rPr>
-                <w:rFonts w:ascii="Aptos" w:hAnsi="Aptos"/>
-                <w:b w:val="0"/>
-                <w:color w:val="243746"/>
-                <w:sz w:val="16"/>
-              </w:rPr>
-              <w:t>Evidencia histórica desactualizada</w:t>
+              <w:t>Alcance temporal del resultado</w:t>
             </w:r>
           </w:p>
         </w:tc>
@@ -2760,18 +2714,8 @@
             <w:vAlign w:val="center"/>
           </w:tcPr>
           <w:p>
-            <w:pPr>
-              <w:spacing w:after="20" w:before="20"/>
-            </w:pPr>
-            <w:r/>
             <w:r>
-              <w:rPr>
-                <w:rFonts w:ascii="Aptos" w:hAnsi="Aptos"/>
-                <w:b w:val="0"/>
-                <w:color w:val="243746"/>
-                <w:sz w:val="16"/>
-              </w:rPr>
-              <w:t>La exposición podría atribuir al estado actual una ejecución pasada.</w:t>
+              <w:t>Interpretar la cifra fuera de la ejecución documentada.</w:t>
             </w:r>
           </w:p>
         </w:tc>
@@ -2781,18 +2725,8 @@
             <w:vAlign w:val="center"/>
           </w:tcPr>
           <w:p>
-            <w:pPr>
-              <w:spacing w:after="20" w:before="20"/>
-            </w:pPr>
-            <w:r/>
             <w:r>
-              <w:rPr>
-                <w:rFonts w:ascii="Aptos" w:hAnsi="Aptos"/>
-                <w:b w:val="0"/>
-                <w:color w:val="243746"/>
-                <w:sz w:val="16"/>
-              </w:rPr>
-              <w:t>Volver a ejecutar npm run cy:run el 18/10 o antes de presentar y actualizar los resultados con la salida real.</w:t>
+              <w:t>Identificar fecha y versión de cada ejecución; distinguir evidencia medida de cobertura definida.</w:t>
             </w:r>
           </w:p>
         </w:tc>
@@ -2813,7 +2747,7 @@
     </w:p>
     <w:p>
       <w:r>
-        <w:t>El equipo se organiza con Scrum ligero para priorizar historias, revisar avances y preparar una entrega demostrable. Noemy Molina Garron facilita el proceso como Scrum Master. La asignación técnica de las otras integrantes se presenta como propuesta y debe ajustarse a lo que cada persona efectivamente realizó.</w:t>
+        <w:t>La práctica se organiza con Scrum ligero para priorizar historias, revisar avances e integrar los entregables. Noemy Molina Garron facilita el proceso como Scrum Master. Wendy Ramirez Veizaga concentra el plan y los flujos de administración; Natalia Romero Cuqui, las historias y casos de paciente; Alex Joshua Villegas Ibanez, los flujos de doctor y la exposición. La revisión cruzada involucra a todo el equipo.</w:t>
       </w:r>
     </w:p>
     <w:tbl>
@@ -2950,18 +2884,8 @@
             <w:shd w:fill="F4F8FA"/>
           </w:tcPr>
           <w:p>
-            <w:pPr>
-              <w:spacing w:after="20" w:before="20"/>
-            </w:pPr>
-            <w:r/>
             <w:r>
-              <w:rPr>
-                <w:rFonts w:ascii="Aptos" w:hAnsi="Aptos"/>
-                <w:b w:val="0"/>
-                <w:color w:val="243746"/>
-                <w:sz w:val="16"/>
-              </w:rPr>
-              <w:t>Plan de pruebas y smoke test; revisión de flujos administrativos CP-01–CP-07.</w:t>
+              <w:t>Plan de pruebas, smoke test y revisión de administración.</w:t>
             </w:r>
           </w:p>
         </w:tc>
@@ -2994,18 +2918,8 @@
             <w:vAlign w:val="center"/>
           </w:tcPr>
           <w:p>
-            <w:pPr>
-              <w:spacing w:after="20" w:before="20"/>
-            </w:pPr>
-            <w:r/>
             <w:r>
-              <w:rPr>
-                <w:rFonts w:ascii="Aptos" w:hAnsi="Aptos"/>
-                <w:b w:val="0"/>
-                <w:color w:val="243746"/>
-                <w:sz w:val="16"/>
-              </w:rPr>
-              <w:t>Historias y casos de paciente; registro, login y citas HU-07–HU-13 / CP-08–CP-15.</w:t>
+              <w:t>Historias, casos y trazabilidad de paciente y citas.</w:t>
             </w:r>
           </w:p>
         </w:tc>
@@ -3040,18 +2954,8 @@
             <w:shd w:fill="F4F8FA"/>
           </w:tcPr>
           <w:p>
-            <w:pPr>
-              <w:spacing w:after="20" w:before="20"/>
-            </w:pPr>
-            <w:r/>
             <w:r>
-              <w:rPr>
-                <w:rFonts w:ascii="Aptos" w:hAnsi="Aptos"/>
-                <w:b w:val="0"/>
-                <w:color w:val="243746"/>
-                <w:sz w:val="16"/>
-              </w:rPr>
-              <w:t>Casos de doctor CP-17–CP-21; revisión de regresión y guion/demo GitHub.</w:t>
+              <w:t>Flujos de doctor, regresión y preparación de exposición.</w:t>
             </w:r>
           </w:p>
         </w:tc>
@@ -3063,8 +2967,12 @@
       </w:pPr>
     </w:p>
     <w:p>
+      <w:pPr>
+        <w:pStyle w:val="Heading2"/>
+        <w:pageBreakBefore/>
+      </w:pPr>
       <w:r>
-        <w:t>El reparto técnico es una propuesta de trabajo acordada para esta práctica y puede ajustarse por el equipo. No representa actividades ya terminadas. La Scrum Master facilita la coordinación; la responsabilidad de completar y revisar los entregables es compartida.</w:t>
+        <w:t>Responsabilidades por tarea</w:t>
       </w:r>
     </w:p>
     <w:tbl>
@@ -3094,7 +3002,12 @@
             <w:pPr>
               <w:spacing w:after="20" w:before="20"/>
             </w:pPr>
-            <w:r/>
+            <w:r>
+              <w:rPr>
+                <w:b/>
+                <w:color w:val="FFFFFF"/>
+              </w:rPr>
+            </w:r>
             <w:r>
               <w:rPr>
                 <w:rFonts w:ascii="Aptos" w:hAnsi="Aptos"/>
@@ -3116,7 +3029,12 @@
             <w:pPr>
               <w:spacing w:after="20" w:before="20"/>
             </w:pPr>
-            <w:r/>
+            <w:r>
+              <w:rPr>
+                <w:b/>
+                <w:color w:val="FFFFFF"/>
+              </w:rPr>
+            </w:r>
             <w:r>
               <w:rPr>
                 <w:rFonts w:ascii="Aptos" w:hAnsi="Aptos"/>
@@ -3135,18 +3053,12 @@
             <w:shd w:fill="12304A"/>
           </w:tcPr>
           <w:p>
-            <w:pPr>
-              <w:spacing w:after="20" w:before="20"/>
-            </w:pPr>
-            <w:r/>
             <w:r>
               <w:rPr>
-                <w:rFonts w:ascii="Aptos" w:hAnsi="Aptos"/>
                 <w:b/>
                 <w:color w:val="FFFFFF"/>
-                <w:sz w:val="17"/>
               </w:rPr>
-              <w:t>Fecha objetivo</w:t>
+              <w:t>Fecha / hito</w:t>
             </w:r>
           </w:p>
         </w:tc>
@@ -3160,7 +3072,12 @@
             <w:pPr>
               <w:spacing w:after="20" w:before="20"/>
             </w:pPr>
-            <w:r/>
+            <w:r>
+              <w:rPr>
+                <w:b/>
+                <w:color w:val="FFFFFF"/>
+              </w:rPr>
+            </w:r>
             <w:r>
               <w:rPr>
                 <w:rFonts w:ascii="Aptos" w:hAnsi="Aptos"/>
@@ -3180,17 +3097,7 @@
             <w:vAlign w:val="center"/>
           </w:tcPr>
           <w:p>
-            <w:pPr>
-              <w:spacing w:after="20" w:before="20"/>
-            </w:pPr>
-            <w:r/>
             <w:r>
-              <w:rPr>
-                <w:rFonts w:ascii="Aptos" w:hAnsi="Aptos"/>
-                <w:b w:val="0"/>
-                <w:color w:val="243746"/>
-                <w:sz w:val="15"/>
-              </w:rPr>
               <w:t>SQA-01/02 · Scrum, entorno y guía VS Code</w:t>
             </w:r>
           </w:p>
@@ -3201,17 +3108,7 @@
             <w:vAlign w:val="center"/>
           </w:tcPr>
           <w:p>
-            <w:pPr>
-              <w:spacing w:after="20" w:before="20"/>
-            </w:pPr>
-            <w:r/>
             <w:r>
-              <w:rPr>
-                <w:rFonts w:ascii="Aptos" w:hAnsi="Aptos"/>
-                <w:b w:val="0"/>
-                <w:color w:val="243746"/>
-                <w:sz w:val="15"/>
-              </w:rPr>
               <w:t>Noemy Molina Garron</w:t>
             </w:r>
           </w:p>
@@ -3222,18 +3119,8 @@
             <w:vAlign w:val="center"/>
           </w:tcPr>
           <w:p>
-            <w:pPr>
-              <w:spacing w:after="20" w:before="20"/>
-            </w:pPr>
-            <w:r/>
             <w:r>
-              <w:rPr>
-                <w:rFonts w:ascii="Aptos" w:hAnsi="Aptos"/>
-                <w:b w:val="0"/>
-                <w:color w:val="243746"/>
-                <w:sz w:val="15"/>
-              </w:rPr>
-              <w:t>14–18/10</w:t>
+              <w:t>12–18/10</w:t>
             </w:r>
           </w:p>
         </w:tc>
@@ -3243,18 +3130,8 @@
             <w:vAlign w:val="center"/>
           </w:tcPr>
           <w:p>
-            <w:pPr>
-              <w:spacing w:after="20" w:before="20"/>
-            </w:pPr>
-            <w:r/>
             <w:r>
-              <w:rPr>
-                <w:rFonts w:ascii="Aptos" w:hAnsi="Aptos"/>
-                <w:b w:val="0"/>
-                <w:color w:val="243746"/>
-                <w:sz w:val="15"/>
-              </w:rPr>
-              <w:t>Tablero visible; Docker/MySQL y pasos de Cypress documentados; acuerdos y bloqueos registrados.</w:t>
+              <w:t>Tablero público con diez Issues; guía VS Code para Docker, MySQL y Cypress.</w:t>
             </w:r>
           </w:p>
         </w:tc>
@@ -3267,17 +3144,7 @@
             <w:shd w:fill="F4F8FA"/>
           </w:tcPr>
           <w:p>
-            <w:pPr>
-              <w:spacing w:after="20" w:before="20"/>
-            </w:pPr>
-            <w:r/>
             <w:r>
-              <w:rPr>
-                <w:rFonts w:ascii="Aptos" w:hAnsi="Aptos"/>
-                <w:b w:val="0"/>
-                <w:color w:val="243746"/>
-                <w:sz w:val="15"/>
-              </w:rPr>
               <w:t>SQA-03/04 · plan, smoke y casos admin</w:t>
             </w:r>
           </w:p>
@@ -3289,17 +3156,7 @@
             <w:shd w:fill="F4F8FA"/>
           </w:tcPr>
           <w:p>
-            <w:pPr>
-              <w:spacing w:after="20" w:before="20"/>
-            </w:pPr>
-            <w:r/>
             <w:r>
-              <w:rPr>
-                <w:rFonts w:ascii="Aptos" w:hAnsi="Aptos"/>
-                <w:b w:val="0"/>
-                <w:color w:val="243746"/>
-                <w:sz w:val="15"/>
-              </w:rPr>
               <w:t>Wendy Ramirez Veizaga</w:t>
             </w:r>
           </w:p>
@@ -3311,18 +3168,8 @@
             <w:shd w:fill="F4F8FA"/>
           </w:tcPr>
           <w:p>
-            <w:pPr>
-              <w:spacing w:after="20" w:before="20"/>
-            </w:pPr>
-            <w:r/>
             <w:r>
-              <w:rPr>
-                <w:rFonts w:ascii="Aptos" w:hAnsi="Aptos"/>
-                <w:b w:val="0"/>
-                <w:color w:val="243746"/>
-                <w:sz w:val="15"/>
-              </w:rPr>
-              <w:t>15–16/10</w:t>
+              <w:t>14–16/10</w:t>
             </w:r>
           </w:p>
         </w:tc>
@@ -3333,18 +3180,8 @@
             <w:shd w:fill="F4F8FA"/>
           </w:tcPr>
           <w:p>
-            <w:pPr>
-              <w:spacing w:after="20" w:before="20"/>
-            </w:pPr>
-            <w:r/>
             <w:r>
-              <w:rPr>
-                <w:rFonts w:ascii="Aptos" w:hAnsi="Aptos"/>
-                <w:b w:val="0"/>
-                <w:color w:val="243746"/>
-                <w:sz w:val="15"/>
-              </w:rPr>
-              <w:t>Plan y CP-01–CP-07 concuerdan con matriz, aplicación y resultados esperados.</w:t>
+              <w:t>Informe Word y CP-01–CP-07 relacionados con el alcance y la aplicación.</w:t>
             </w:r>
           </w:p>
         </w:tc>
@@ -3356,18 +3193,8 @@
             <w:vAlign w:val="center"/>
           </w:tcPr>
           <w:p>
-            <w:pPr>
-              <w:spacing w:after="20" w:before="20"/>
-            </w:pPr>
-            <w:r/>
             <w:r>
-              <w:rPr>
-                <w:rFonts w:ascii="Aptos" w:hAnsi="Aptos"/>
-                <w:b w:val="0"/>
-                <w:color w:val="243746"/>
-                <w:sz w:val="15"/>
-              </w:rPr>
-              <w:t>SQA-05/08 · historias y Excel paciente</w:t>
+              <w:t>SQA-05/08 · historias, citas y matriz</w:t>
             </w:r>
           </w:p>
         </w:tc>
@@ -3377,17 +3204,7 @@
             <w:vAlign w:val="center"/>
           </w:tcPr>
           <w:p>
-            <w:pPr>
-              <w:spacing w:after="20" w:before="20"/>
-            </w:pPr>
-            <w:r/>
             <w:r>
-              <w:rPr>
-                <w:rFonts w:ascii="Aptos" w:hAnsi="Aptos"/>
-                <w:b w:val="0"/>
-                <w:color w:val="243746"/>
-                <w:sz w:val="15"/>
-              </w:rPr>
               <w:t>Natalia Romero Cuqui</w:t>
             </w:r>
           </w:p>
@@ -3398,18 +3215,8 @@
             <w:vAlign w:val="center"/>
           </w:tcPr>
           <w:p>
-            <w:pPr>
-              <w:spacing w:after="20" w:before="20"/>
-            </w:pPr>
-            <w:r/>
             <w:r>
-              <w:rPr>
-                <w:rFonts w:ascii="Aptos" w:hAnsi="Aptos"/>
-                <w:b w:val="0"/>
-                <w:color w:val="243746"/>
-                <w:sz w:val="15"/>
-              </w:rPr>
-              <w:t>16–17/10</w:t>
+              <w:t>14–17/10</w:t>
             </w:r>
           </w:p>
         </w:tc>
@@ -3419,18 +3226,8 @@
             <w:vAlign w:val="center"/>
           </w:tcPr>
           <w:p>
-            <w:pPr>
-              <w:spacing w:after="20" w:before="20"/>
-            </w:pPr>
-            <w:r/>
             <w:r>
-              <w:rPr>
-                <w:rFonts w:ascii="Aptos" w:hAnsi="Aptos"/>
-                <w:b w:val="0"/>
-                <w:color w:val="243746"/>
-                <w:sz w:val="15"/>
-              </w:rPr>
-              <w:t>HU-07–HU-13 y CP-08–CP-15 trazables; matriz revisada y datos de prueba sintéticos.</w:t>
+              <w:t>Excel con 20 historias, 23 casos, datos sintéticos y trazabilidad.</w:t>
             </w:r>
           </w:p>
         </w:tc>
@@ -3443,18 +3240,8 @@
             <w:shd w:fill="F4F8FA"/>
           </w:tcPr>
           <w:p>
-            <w:pPr>
-              <w:spacing w:after="20" w:before="20"/>
-            </w:pPr>
-            <w:r/>
             <w:r>
-              <w:rPr>
-                <w:rFonts w:ascii="Aptos" w:hAnsi="Aptos"/>
-                <w:b w:val="0"/>
-                <w:color w:val="243746"/>
-                <w:sz w:val="15"/>
-              </w:rPr>
-              <w:t>SQA-06/09 · casos doctor, regresión y exposición</w:t>
+              <w:t>SQA-06/09 · casos doctor y exposición</w:t>
             </w:r>
           </w:p>
         </w:tc>
@@ -3465,17 +3252,7 @@
             <w:shd w:fill="F4F8FA"/>
           </w:tcPr>
           <w:p>
-            <w:pPr>
-              <w:spacing w:after="20" w:before="20"/>
-            </w:pPr>
-            <w:r/>
             <w:r>
-              <w:rPr>
-                <w:rFonts w:ascii="Aptos" w:hAnsi="Aptos"/>
-                <w:b w:val="0"/>
-                <w:color w:val="243746"/>
-                <w:sz w:val="15"/>
-              </w:rPr>
               <w:t>Alex Joshua Villegas Ibanez</w:t>
             </w:r>
           </w:p>
@@ -3487,18 +3264,8 @@
             <w:shd w:fill="F4F8FA"/>
           </w:tcPr>
           <w:p>
-            <w:pPr>
-              <w:spacing w:after="20" w:before="20"/>
-            </w:pPr>
-            <w:r/>
             <w:r>
-              <w:rPr>
-                <w:rFonts w:ascii="Aptos" w:hAnsi="Aptos"/>
-                <w:b w:val="0"/>
-                <w:color w:val="243746"/>
-                <w:sz w:val="15"/>
-              </w:rPr>
-              <w:t>17–18/10</w:t>
+              <w:t>15–18/10</w:t>
             </w:r>
           </w:p>
         </w:tc>
@@ -3509,18 +3276,8 @@
             <w:shd w:fill="F4F8FA"/>
           </w:tcPr>
           <w:p>
-            <w:pPr>
-              <w:spacing w:after="20" w:before="20"/>
-            </w:pPr>
-            <w:r/>
             <w:r>
-              <w:rPr>
-                <w:rFonts w:ascii="Aptos" w:hAnsi="Aptos"/>
-                <w:b w:val="0"/>
-                <w:color w:val="243746"/>
-                <w:sz w:val="15"/>
-              </w:rPr>
-              <w:t>CP-17–CP-21 revisados; guion y ensayo listos con evidencia real.</w:t>
+              <w:t>CP-17–CP-21 documentados; presentación y guion oral organizados.</w:t>
             </w:r>
           </w:p>
         </w:tc>
@@ -3532,18 +3289,8 @@
             <w:vAlign w:val="center"/>
           </w:tcPr>
           <w:p>
-            <w:pPr>
-              <w:spacing w:after="20" w:before="20"/>
-            </w:pPr>
-            <w:r/>
             <w:r>
-              <w:rPr>
-                <w:rFonts w:ascii="Aptos" w:hAnsi="Aptos"/>
-                <w:b w:val="0"/>
-                <w:color w:val="243746"/>
-                <w:sz w:val="15"/>
-              </w:rPr>
-              <w:t>SQA-07/10 · integración y presentación</w:t>
+              <w:t>SQA-07/10 · Cypress e integración</w:t>
             </w:r>
           </w:p>
         </w:tc>
@@ -3553,17 +3300,7 @@
             <w:vAlign w:val="center"/>
           </w:tcPr>
           <w:p>
-            <w:pPr>
-              <w:spacing w:after="20" w:before="20"/>
-            </w:pPr>
-            <w:r/>
             <w:r>
-              <w:rPr>
-                <w:rFonts w:ascii="Aptos" w:hAnsi="Aptos"/>
-                <w:b w:val="0"/>
-                <w:color w:val="243746"/>
-                <w:sz w:val="15"/>
-              </w:rPr>
               <w:t>Todo el equipo; facilita Noemy</w:t>
             </w:r>
           </w:p>
@@ -3574,18 +3311,8 @@
             <w:vAlign w:val="center"/>
           </w:tcPr>
           <w:p>
-            <w:pPr>
-              <w:spacing w:after="20" w:before="20"/>
-            </w:pPr>
-            <w:r/>
             <w:r>
-              <w:rPr>
-                <w:rFonts w:ascii="Aptos" w:hAnsi="Aptos"/>
-                <w:b w:val="0"/>
-                <w:color w:val="243746"/>
-                <w:sz w:val="15"/>
-              </w:rPr>
-              <w:t>18–19/10</w:t>
+              <w:t>14–19/10</w:t>
             </w:r>
           </w:p>
         </w:tc>
@@ -3595,18 +3322,8 @@
             <w:vAlign w:val="center"/>
           </w:tcPr>
           <w:p>
-            <w:pPr>
-              <w:spacing w:after="20" w:before="20"/>
-            </w:pPr>
-            <w:r/>
             <w:r>
-              <w:rPr>
-                <w:rFonts w:ascii="Aptos" w:hAnsi="Aptos"/>
-                <w:b w:val="0"/>
-                <w:color w:val="243746"/>
-                <w:sz w:val="15"/>
-              </w:rPr>
-              <w:t>Suite reejecutada; resultados observados registrados; cuatro entregables revisados y presentados.</w:t>
+              <w:t>Spec CP-01–CP-22; ejecución 14/10: 22 passing, 0 failing, 0 pending; cuatro archivos integrados.</w:t>
             </w:r>
           </w:p>
         </w:tc>
@@ -3618,8 +3335,11 @@
       </w:pPr>
     </w:p>
     <w:p>
+      <w:pPr>
+        <w:pStyle w:val="Heading2"/>
+      </w:pPr>
       <w:r>
-        <w:t>El detalle de las diez tareas, estados iniciales, criterios y ceremonias está en docs/05-TABLERO-SCRUM.md y en la hoja «Tablero Scrum» del Excel. Las reuniones posteriores al 14/10 son planificadas; añadir asistencia y acuerdos solo después de realizarlas.</w:t>
+        <w:t>Cronograma del equipo</w:t>
       </w:r>
     </w:p>
     <w:p>
@@ -3653,7 +3373,12 @@
             <w:pPr>
               <w:spacing w:after="20" w:before="20"/>
             </w:pPr>
-            <w:r/>
+            <w:r>
+              <w:rPr>
+                <w:b/>
+                <w:color w:val="FFFFFF"/>
+              </w:rPr>
+            </w:r>
             <w:r>
               <w:rPr>
                 <w:rFonts w:ascii="Aptos" w:hAnsi="Aptos"/>
@@ -3672,18 +3397,12 @@
             <w:shd w:fill="12304A"/>
           </w:tcPr>
           <w:p>
-            <w:pPr>
-              <w:spacing w:after="20" w:before="20"/>
-            </w:pPr>
-            <w:r/>
             <w:r>
               <w:rPr>
-                <w:rFonts w:ascii="Aptos" w:hAnsi="Aptos"/>
                 <w:b/>
                 <w:color w:val="FFFFFF"/>
-                <w:sz w:val="17"/>
               </w:rPr>
-              <w:t>Reunión o actividad</w:t>
+              <w:t>Actividad</w:t>
             </w:r>
           </w:p>
         </w:tc>
@@ -3694,18 +3413,12 @@
             <w:shd w:fill="12304A"/>
           </w:tcPr>
           <w:p>
-            <w:pPr>
-              <w:spacing w:after="20" w:before="20"/>
-            </w:pPr>
-            <w:r/>
             <w:r>
               <w:rPr>
-                <w:rFonts w:ascii="Aptos" w:hAnsi="Aptos"/>
                 <w:b/>
                 <w:color w:val="FFFFFF"/>
-                <w:sz w:val="17"/>
               </w:rPr>
-              <w:t>Resultado esperado / estado</w:t>
+              <w:t>Enfoque de trabajo</w:t>
             </w:r>
           </w:p>
         </w:tc>
@@ -3759,18 +3472,8 @@
             <w:vAlign w:val="center"/>
           </w:tcPr>
           <w:p>
-            <w:pPr>
-              <w:spacing w:after="20" w:before="20"/>
-            </w:pPr>
-            <w:r/>
             <w:r>
-              <w:rPr>
-                <w:rFonts w:ascii="Aptos" w:hAnsi="Aptos"/>
-                <w:b w:val="0"/>
-                <w:color w:val="243746"/>
-                <w:sz w:val="16"/>
-              </w:rPr>
-              <w:t>Docker y MySQL levantados, según lo reportado por el equipo. Realizado.</w:t>
+              <w:t>Entorno Docker y MySQL levantado, según lo reportado por el equipo.</w:t>
             </w:r>
           </w:p>
         </w:tc>
@@ -3827,18 +3530,8 @@
             <w:shd w:fill="F4F8FA"/>
           </w:tcPr>
           <w:p>
-            <w:pPr>
-              <w:spacing w:after="20" w:before="20"/>
-            </w:pPr>
-            <w:r/>
             <w:r>
-              <w:rPr>
-                <w:rFonts w:ascii="Aptos" w:hAnsi="Aptos"/>
-                <w:b w:val="0"/>
-                <w:color w:val="243746"/>
-                <w:sz w:val="16"/>
-              </w:rPr>
-              <w:t>Acordar alcance, roles, prioridades y entregables; iniciar consolidación. Actividad en curso según la fecha de este informe.</w:t>
+              <w:t>Alcance, roles, prioridades, historias, casos y entregables.</w:t>
             </w:r>
           </w:p>
         </w:tc>
@@ -3892,18 +3585,8 @@
             <w:vAlign w:val="center"/>
           </w:tcPr>
           <w:p>
-            <w:pPr>
-              <w:spacing w:after="20" w:before="20"/>
-            </w:pPr>
-            <w:r/>
             <w:r>
-              <w:rPr>
-                <w:rFonts w:ascii="Aptos" w:hAnsi="Aptos"/>
-                <w:b w:val="0"/>
-                <w:color w:val="243746"/>
-                <w:sz w:val="16"/>
-              </w:rPr>
-              <w:t>Revisar pasos, precondiciones, datos y criterios; registrar impedimentos. Planificado.</w:t>
+              <w:t>Precondiciones, datos de prueba, pasos y resultados esperados.</w:t>
             </w:r>
           </w:p>
         </w:tc>
@@ -3960,18 +3643,8 @@
             <w:shd w:fill="F4F8FA"/>
           </w:tcPr>
           <w:p>
-            <w:pPr>
-              <w:spacing w:after="20" w:before="20"/>
-            </w:pPr>
-            <w:r/>
             <w:r>
-              <w:rPr>
-                <w:rFonts w:ascii="Aptos" w:hAnsi="Aptos"/>
-                <w:b w:val="0"/>
-                <w:color w:val="243746"/>
-                <w:sz w:val="16"/>
-              </w:rPr>
-              <w:t>Relacionar casos con el spec y revisar los flujos implementados. Planificado.</w:t>
+              <w:t>Relación entre los casos de prueba y la suite Cypress.</w:t>
             </w:r>
           </w:p>
         </w:tc>
@@ -4025,18 +3698,8 @@
             <w:vAlign w:val="center"/>
           </w:tcPr>
           <w:p>
-            <w:pPr>
-              <w:spacing w:after="20" w:before="20"/>
-            </w:pPr>
-            <w:r/>
             <w:r>
-              <w:rPr>
-                <w:rFonts w:ascii="Aptos" w:hAnsi="Aptos"/>
-                <w:b w:val="0"/>
-                <w:color w:val="243746"/>
-                <w:sz w:val="16"/>
-              </w:rPr>
-              <w:t>Consolidar Word, Excel, resultados y trazabilidad. Planificado.</w:t>
+              <w:t>Coherencia entre plan, matriz, automatización y evidencia.</w:t>
             </w:r>
           </w:p>
         </w:tc>
@@ -4093,18 +3756,8 @@
             <w:shd w:fill="F4F8FA"/>
           </w:tcPr>
           <w:p>
-            <w:pPr>
-              <w:spacing w:after="20" w:before="20"/>
-            </w:pPr>
-            <w:r/>
             <w:r>
-              <w:rPr>
-                <w:rFonts w:ascii="Aptos" w:hAnsi="Aptos"/>
-                <w:b w:val="0"/>
-                <w:color w:val="243746"/>
-                <w:sz w:val="16"/>
-              </w:rPr>
-              <w:t>Reejecutar Cypress, actualizar evidencia y practicar la presentación. Planificado.</w:t>
+              <w:t>Integración de entregables y secuencia de exposición.</w:t>
             </w:r>
           </w:p>
         </w:tc>
@@ -4158,18 +3811,8 @@
             <w:vAlign w:val="center"/>
           </w:tcPr>
           <w:p>
-            <w:pPr>
-              <w:spacing w:after="20" w:before="20"/>
-            </w:pPr>
-            <w:r/>
             <w:r>
-              <w:rPr>
-                <w:rFonts w:ascii="Aptos" w:hAnsi="Aptos"/>
-                <w:b w:val="0"/>
-                <w:color w:val="243746"/>
-                <w:sz w:val="16"/>
-              </w:rPr>
-              <w:t>Exponer entregables, entorno, cobertura, resultados y organización del equipo. Fecha de presentación.</w:t>
+              <w:t>Presentación de entorno, cobertura, resultados y organización Scrum/Git.</w:t>
             </w:r>
           </w:p>
         </w:tc>
@@ -4182,7 +3825,7 @@
     </w:p>
     <w:p>
       <w:r>
-        <w:t>Las reuniones del 15 al 18 son parte del calendario propuesto; registrar participantes, acuerdos y bloqueos después de cada reunión para que el informe final refleje lo que realmente ocurrió.</w:t>
+        <w:t>El cronograma del 12 al 19/10 describe la secuencia de actividades, desde el levantamiento del entorno hasta la exposición académica.</w:t>
       </w:r>
     </w:p>
     <w:p>
@@ -4200,7 +3843,7 @@
     </w:p>
     <w:p>
       <w:r>
-        <w:t>Git registra versiones y ramas en el proyecto. GitHub aloja el repositorio compartido bajo la cuenta personal Lurey14 (Noemy), no bajo una organización. El repositorio público es github.com/Lurey14/doctor-patient-portal-sqa-cypress y el tablero Scrum es github.com/users/Lurey14/projects/1/views/1; ambos permiten consultar archivos y las 10 tareas SQA sin invitación. Para contribuir mediante push o Pull Request se requiere permiso. Los responsables se indican por nombre completo; los usernames de Wendy, Natalia y Alex hacen falta para invitarlas con escritura. El código fuente original pertenece al repositorio indicado por el curso; esta entrega es una copia académica y no reemplaza ni modifica el original.</w:t>
+        <w:t>El repositorio público permite consultar archivos e Issues; cada integrante obtiene permiso de escritura mediante una invitación individual de GitHub.</w:t>
       </w:r>
     </w:p>
     <w:p>
@@ -4612,7 +4255,7 @@
     </w:p>
     <w:p>
       <w:r>
-        <w:t>El trabajo documenta una ruta verificable desde el entorno local hasta la automatización de los principales recorridos del portal. Antes de entregar, el equipo debe realizar la revisión final, actualizar los estados del cronograma y repetir Cypress en el mismo entorno de la presentación. La matriz Excel y el spec Cypress aportan el detalle operativo de cada caso.</w:t>
+        <w:t>La versión de entrega integra el plan de pruebas, 20 historias de usuario, 23 casos, 22 escenarios automatizados y la exposición del equipo. La ejecución documentada el 14 de octubre de 2026 obtuvo 22 aprobados, 0 fallidos y 0 pendientes. CP-23 identifica como brecha el registro de otra cuenta administrativa, función ausente de la versión evaluada.</w:t>
       </w:r>
     </w:p>
     <w:sectPr>

</xml_diff>